<commit_message>
Services: final texts for every [CONFIRMAR] (ES + EN)
MOVO validated the open data: monthly plan of 8, 12 or more pieces; finished
productions from a couple of days (complex projects a couple of weeks); two
rounds of revisions; quote within 48 hours; licensed music and professional
voiceover included; clients in Mexico, the US and anywhere in the world. No
prices on the site; the CTA stays "Empieza un proyecto". Updated in the source
document (.docx + .md copy) and regenerated with import-doc.py.

Co-Authored-By: Claude Opus 5.5 <noreply@anthropic.com>
Claude-Session: https://claude.ai/code/session_01DdJBUHfmDGz3zRD1HSGuw1
</commit_message>
<xml_diff>
--- a/docs/MOVO-Servicios-textos-ES-EN-y-direccion-de-diseno.docx
+++ b/docs/MOVO-Servicios-textos-ES-EN-y-direccion-de-diseno.docx
@@ -2132,7 +2132,7 @@
           <w:p>
             <w:pPr/>
             <w:r>
-              <w:t xml:space="preserve">Paquete mensual de piezas según el plan [CONFIRMAR número de piezas] / Monthly set of pieces per plan</w:t>
+              <w:t>8, 12 o más piezas al mes, adaptadas a lo que necesita tu marca / 8, 12 or more pieces a month, adapted to what your brand needs</w:t>
             </w:r>
           </w:p>
         </w:tc>
@@ -3151,7 +3151,7 @@
           <w:p>
             <w:pPr/>
             <w:r>
-              <w:t xml:space="preserve">Depende del alcance. Un logo animado puede estar en una a dos semanas y un explainer en tres a cinco. Te damos un calendario desde la propuesta. [CONFIRMAR]</w:t>
+              <w:t>Depende de la complejidad. Podemos entregar producciones terminadas en un par de días; los proyectos más complejos toman un par de semanas. Te damos un calendario desde la propuesta.</w:t>
             </w:r>
           </w:p>
         </w:tc>
@@ -3173,7 +3173,7 @@
           <w:p>
             <w:pPr/>
             <w:r>
-              <w:t xml:space="preserve">It depends on scope. An animated logo can take one to two weeks, an explainer three to five. You get a schedule with the proposal.</w:t>
+              <w:t>It depends on complexity. We can deliver finished productions in a couple of days; more complex projects take a couple of weeks. You get a schedule with the proposal.</w:t>
             </w:r>
           </w:p>
         </w:tc>
@@ -3197,7 +3197,7 @@
           <w:p>
             <w:pPr/>
             <w:r>
-              <w:t xml:space="preserve">Dos rondas en cada etapa clave: guion, styleframes y animación. [CONFIRMAR]</w:t>
+              <w:t>Dos rondas de revisión en cada etapa clave: guion, styleframes y animación.</w:t>
             </w:r>
           </w:p>
         </w:tc>
@@ -3219,7 +3219,7 @@
           <w:p>
             <w:pPr/>
             <w:r>
-              <w:t xml:space="preserve">Two rounds at each key stage: script, styleframes and animation.</w:t>
+              <w:t>Two rounds of revisions at each key stage: script, styleframes and animation.</w:t>
             </w:r>
           </w:p>
         </w:tc>
@@ -3289,7 +3289,7 @@
           <w:p>
             <w:pPr/>
             <w:r>
-              <w:t xml:space="preserve">Cada proyecto se cotiza según duración, complejidad y número de piezas. Cuéntanos qué necesitas y te enviamos una propuesta en 48 horas. [CONFIRMAR]</w:t>
+              <w:t>Cada proyecto se cotiza según su duración, complejidad y número de piezas, por eso no publicamos precios fijos. Cuéntanos qué necesitas y te enviamos una cotización en no más de 48 horas.</w:t>
             </w:r>
           </w:p>
         </w:tc>
@@ -3311,7 +3311,7 @@
           <w:p>
             <w:pPr/>
             <w:r>
-              <w:t xml:space="preserve">Every project is quoted by length, complexity and number of pieces. Tell us what you need and we'll send a proposal within 48 hours.</w:t>
+              <w:t>Every project is quoted by length, complexity and number of pieces, so we don't publish fixed prices. Tell us what you need and we'll send you a quote within 48 hours.</w:t>
             </w:r>
           </w:p>
         </w:tc>
@@ -3335,7 +3335,7 @@
           <w:p>
             <w:pPr/>
             <w:r>
-              <w:t xml:space="preserve">Sí. Musicalizamos con librerías con licencia y coordinamos locución profesional cuando el proyecto lo pide. [CONFIRMAR]</w:t>
+              <w:t>Sí. Incluimos música con licencia y locución profesional.</w:t>
             </w:r>
           </w:p>
         </w:tc>
@@ -3357,7 +3357,7 @@
           <w:p>
             <w:pPr/>
             <w:r>
-              <w:t xml:space="preserve">Yes. We score with licensed libraries and arrange professional voiceover when the project calls for it.</w:t>
+              <w:t>Yes. We include licensed music and professional voiceover.</w:t>
             </w:r>
           </w:p>
         </w:tc>
@@ -3381,7 +3381,7 @@
           <w:p>
             <w:pPr/>
             <w:r>
-              <w:t xml:space="preserve">Sí. Trabajamos a distancia, en español y en inglés. [CONFIRMAR]</w:t>
+              <w:t>Sí. Trabajamos con clientes en México, Estados Unidos y cualquier parte del mundo, a distancia y en español o inglés.</w:t>
             </w:r>
           </w:p>
         </w:tc>
@@ -3403,7 +3403,7 @@
           <w:p>
             <w:pPr/>
             <w:r>
-              <w:t xml:space="preserve">Yes. We work remotely, in Spanish and English.</w:t>
+              <w:t>Yes. We work with clients in Mexico, the United States and anywhere in the world, remotely and in Spanish or English.</w:t>
             </w:r>
           </w:p>
         </w:tc>
@@ -4021,7 +4021,7 @@
         </w:numPr>
       </w:pPr>
       <w:r>
-        <w:t xml:space="preserve">☐ Confirmar los datos marcados [CONFIRMAR]: tiempos de entrega, rondas de revisión, propuesta en 48 horas, música y voz, clientes fuera de México y número de piezas del plan mensual.</w:t>
+        <w:t>☑ Datos confirmados por MOVO (octubre 2026): plan mensual de 8, 12 o más piezas; entregas desde un par de días; dos rondas de revisión; cotización en no más de 48 horas; música con licencia y locución profesional; clientes en México, Estados Unidos y cualquier parte del mundo.</w:t>
       </w:r>
     </w:p>
     <w:p>
@@ -4033,7 +4033,7 @@
         </w:numPr>
       </w:pPr>
       <w:r>
-        <w:t xml:space="preserve">☐ Decidir si se muestran precios "desde" en la página o solo cotización.</w:t>
+        <w:t>☑ Decidido: no se muestran precios en la página; cada proyecto se cotiza.</w:t>
       </w:r>
     </w:p>
     <w:p>
@@ -4045,7 +4045,7 @@
         </w:numPr>
       </w:pPr>
       <w:r>
-        <w:t xml:space="preserve">☐ Definir el texto del botón en todo el sitio: "Empieza un proyecto" (actual) o "Cotiza tu proyecto".</w:t>
+        <w:t>☑ Decidido: el botón en todo el sitio es "Empieza un proyecto".</w:t>
       </w:r>
     </w:p>
     <w:p>
@@ -4057,7 +4057,7 @@
         </w:numPr>
       </w:pPr>
       <w:r>
-        <w:t xml:space="preserve">☐ Asignar un reel real a cada pilar para los previews, cuando se sustituyan los 10 reels MOCK.</w:t>
+        <w:t>☑ Hecho: cada pilar y cada servicio usa un reel real (src/data/services-previews.json), sin repetir videos entre servicios.</w:t>
       </w:r>
     </w:p>
     <w:p>

</xml_diff>

<commit_message>
SEO round: local terms (Querétaro), business JSON-LD, project meta, sitemap lastmod
- Titles / descriptions with "estudio de motion design y animación en
  Querétaro" (home, Work, Contact; Services in its source .docx), all within
  ~62 / ~158 characters; project pages use the short title when long, cut long
  descriptions at a word and no longer share a title across languages.
- Hero eyebrow "Estudio de motion design · Querétaro, México" (short on phones)
  and a footer line on every page; city only, by the owner's choice.
- JSON-LD Organization + ProfessionalService (city address, phone, areas
  served, knowsAbout, parent organization, sameAs from the social URLs).
- Sitemap lastmod; preconnect to the video CDN on Work and project pages.
- CLAUDE.md: SEO notes and the launch steps for www.movomotiondesign.com.

Co-Authored-By: Claude Opus 5.5 <noreply@anthropic.com>
Claude-Session: https://claude.ai/code/session_01DdJBUHfmDGz3zRD1HSGuw1
</commit_message>
<xml_diff>
--- a/docs/MOVO-Servicios-textos-ES-EN-y-direccion-de-diseno.docx
+++ b/docs/MOVO-Servicios-textos-ES-EN-y-direccion-de-diseno.docx
@@ -3621,18 +3621,18 @@
           <w:p>
             <w:pPr/>
             <w:r>
-              <w:t xml:space="preserve">Servicios de motion graphics y animación · MOVO</w:t>
-            </w:r>
-          </w:p>
-        </w:tc>
-        <w:tc>
-          <w:tcPr>
-            <w:tcW w:w="3120" w:type="dxa"/>
-          </w:tcPr>
-          <w:p>
-            <w:pPr/>
-            <w:r>
-              <w:t xml:space="preserve">Motion graphics &amp; animation services · MOVO</w:t>
+              <w:t>Servicios de motion graphics y animación en Querétaro · MOVO</w:t>
+            </w:r>
+          </w:p>
+        </w:tc>
+        <w:tc>
+          <w:tcPr>
+            <w:tcW w:w="3120" w:type="dxa"/>
+          </w:tcPr>
+          <w:p>
+            <w:pPr/>
+            <w:r>
+              <w:t>Motion Graphics &amp; Animation Services · Querétaro · MOVO</w:t>
             </w:r>
           </w:p>
         </w:tc>
@@ -3656,18 +3656,18 @@
           <w:p>
             <w:pPr/>
             <w:r>
-              <w:t xml:space="preserve">Logos animados, reels, anuncios, explainers y visuales para eventos. MOVO es un estudio especializado en motion graphics para marcas.</w:t>
-            </w:r>
-          </w:p>
-        </w:tc>
-        <w:tc>
-          <w:tcPr>
-            <w:tcW w:w="3120" w:type="dxa"/>
-          </w:tcPr>
-          <w:p>
-            <w:pPr/>
-            <w:r>
-              <w:t xml:space="preserve">Animated logos, reels, ads, explainers and event visuals. MOVO is a studio built around motion graphics for brands.</w:t>
+              <w:t>Logos animados, reels, anuncios, explainers y visuales para eventos. MOVO es un estudio de motion graphics en Querétaro, México, para marcas.</w:t>
+            </w:r>
+          </w:p>
+        </w:tc>
+        <w:tc>
+          <w:tcPr>
+            <w:tcW w:w="3120" w:type="dxa"/>
+          </w:tcPr>
+          <w:p>
+            <w:pPr/>
+            <w:r>
+              <w:t>Animated logos, reels, ads, explainers and event visuals. MOVO is a motion graphics studio in Querétaro, Mexico, built for brands.</w:t>
             </w:r>
           </w:p>
         </w:tc>

</xml_diff>